<commit_message>
Moderate changes to contract
Modified contract to fix spelling errors.
</commit_message>
<xml_diff>
--- a/docs/D1 - Team Formation and Contract/COSC2200_OOP3_GroupContractTemplate.docx
+++ b/docs/D1 - Team Formation and Contract/COSC2200_OOP3_GroupContractTemplate.docx
@@ -574,7 +574,7 @@
           </w:tcPr>
           <w:p>
             <w:r>
-              <w:t>N/A</w:t>
+              <w:t>5%</w:t>
             </w:r>
           </w:p>
         </w:tc>
@@ -666,7 +666,10 @@
           </w:tcPr>
           <w:p>
             <w:r>
-              <w:t>20%</w:t>
+              <w:t>15</w:t>
+            </w:r>
+            <w:r>
+              <w:t>%</w:t>
             </w:r>
           </w:p>
         </w:tc>
@@ -828,7 +831,10 @@
           </w:tcPr>
           <w:p>
             <w:r>
-              <w:t>Discord: exz01</w:t>
+              <w:t>Discord</w:t>
+            </w:r>
+            <w:r>
+              <w:t>: exz01</w:t>
             </w:r>
           </w:p>
         </w:tc>
@@ -855,7 +861,10 @@
           </w:tcPr>
           <w:p>
             <w:r>
-              <w:t>Discord: reggie556</w:t>
+              <w:t>Discord</w:t>
+            </w:r>
+            <w:r>
+              <w:t>: reggie556</w:t>
             </w:r>
           </w:p>
         </w:tc>
@@ -882,7 +891,10 @@
           </w:tcPr>
           <w:p>
             <w:r>
-              <w:t>Discord: leaderofbadguys</w:t>
+              <w:t>Discord</w:t>
+            </w:r>
+            <w:r>
+              <w:t>: leaderofbadguys</w:t>
             </w:r>
           </w:p>
         </w:tc>
@@ -932,7 +944,10 @@
         <w:t>Pokémon</w:t>
       </w:r>
       <w:r>
-        <w:t xml:space="preserve"> style </w:t>
+        <w:t>-</w:t>
+      </w:r>
+      <w:r>
+        <w:t xml:space="preserve">style </w:t>
       </w:r>
       <w:r>
         <w:t xml:space="preserve">combat </w:t>
@@ -1064,7 +1079,10 @@
               <w:t xml:space="preserve"> for a long time</w:t>
             </w:r>
             <w:r>
-              <w:t xml:space="preserve">, and </w:t>
+              <w:t>.</w:t>
+            </w:r>
+            <w:r>
+              <w:t xml:space="preserve"> </w:t>
             </w:r>
             <w:r>
               <w:t xml:space="preserve">I </w:t>
@@ -1076,13 +1094,10 @@
               <w:t xml:space="preserve">for it </w:t>
             </w:r>
             <w:r>
-              <w:t>through this game.</w:t>
-            </w:r>
-            <w:r>
-              <w:t xml:space="preserve"> I </w:t>
-            </w:r>
-            <w:r>
-              <w:t>will try to make this a masterpiece</w:t>
+              <w:t>through this gam</w:t>
+            </w:r>
+            <w:r>
+              <w:t>e</w:t>
             </w:r>
             <w:r>
               <w:t>.</w:t>
@@ -1224,7 +1239,13 @@
         <w:t>,</w:t>
       </w:r>
       <w:r>
-        <w:t xml:space="preserve"> this will </w:t>
+        <w:t xml:space="preserve"> this </w:t>
+      </w:r>
+      <w:r>
+        <w:t>may</w:t>
+      </w:r>
+      <w:r>
+        <w:t xml:space="preserve"> </w:t>
       </w:r>
       <w:r>
         <w:t>limit the group</w:t>
@@ -1236,22 +1257,7 @@
         <w:t>s ability to communicate</w:t>
       </w:r>
       <w:r>
-        <w:t xml:space="preserve"> and </w:t>
-      </w:r>
-      <w:r>
-        <w:t xml:space="preserve">it </w:t>
-      </w:r>
-      <w:r>
-        <w:t xml:space="preserve">may </w:t>
-      </w:r>
-      <w:r>
-        <w:t xml:space="preserve">negatively impact the </w:t>
-      </w:r>
-      <w:r>
-        <w:t xml:space="preserve">productivity of </w:t>
-      </w:r>
-      <w:r>
-        <w:t>the group</w:t>
+        <w:t xml:space="preserve"> and could negatively impact our productivity</w:t>
       </w:r>
       <w:r>
         <w:t>.</w:t>
@@ -1507,7 +1513,7 @@
           </w:tcPr>
           <w:p>
             <w:r>
-              <w:t>Plan what to do, and discuss what has been done.</w:t>
+              <w:t>Plan what to do and discuss what has been done.</w:t>
             </w:r>
           </w:p>
         </w:tc>
@@ -1573,7 +1579,13 @@
         <w:t>Schedule implements a weekly sprint structure</w:t>
       </w:r>
       <w:r>
-        <w:t>, incorporating an agile workflow</w:t>
+        <w:t xml:space="preserve">, incorporating an </w:t>
+      </w:r>
+      <w:r>
+        <w:t>A</w:t>
+      </w:r>
+      <w:r>
+        <w:t>gile workflow</w:t>
       </w:r>
       <w:r>
         <w:t>.</w:t>
@@ -1656,7 +1668,14 @@
                 <w:rFonts w:cs="Arial"/>
                 <w:bCs/>
               </w:rPr>
-              <w:t>Discord and/or GitHub</w:t>
+              <w:t>Discord</w:t>
+            </w:r>
+            <w:r>
+              <w:rPr>
+                <w:rFonts w:cs="Arial"/>
+                <w:bCs/>
+              </w:rPr>
+              <w:t xml:space="preserve"> and/or GitHub</w:t>
             </w:r>
             <w:r>
               <w:rPr>
@@ -1809,7 +1828,14 @@
                 <w:rFonts w:cs="Arial"/>
                 <w:bCs/>
               </w:rPr>
-              <w:t>discord video calls will be used as the substitute.</w:t>
+              <w:t>Discord</w:t>
+            </w:r>
+            <w:r>
+              <w:rPr>
+                <w:rFonts w:cs="Arial"/>
+                <w:bCs/>
+              </w:rPr>
+              <w:t xml:space="preserve"> video calls will be used as the substitute.</w:t>
             </w:r>
           </w:p>
         </w:tc>
@@ -1878,13 +1904,20 @@
                 <w:rFonts w:cs="Arial"/>
                 <w:bCs/>
               </w:rPr>
-              <w:t xml:space="preserve">discord, there we will </w:t>
+              <w:t>Discord</w:t>
             </w:r>
             <w:r>
               <w:rPr>
                 <w:rFonts w:cs="Arial"/>
                 <w:bCs/>
               </w:rPr>
+              <w:t xml:space="preserve">, there we will </w:t>
+            </w:r>
+            <w:r>
+              <w:rPr>
+                <w:rFonts w:cs="Arial"/>
+                <w:bCs/>
+              </w:rPr>
               <w:t>subdivide the workload</w:t>
             </w:r>
             <w:r>
@@ -1906,7 +1939,35 @@
                 <w:rFonts w:cs="Arial"/>
                 <w:bCs/>
               </w:rPr>
-              <w:t>Participation will be regularly tracked through the GitHub lab and the discord group chat.</w:t>
+              <w:t xml:space="preserve">Participation will be regularly tracked through the GitHub </w:t>
+            </w:r>
+            <w:r>
+              <w:rPr>
+                <w:rFonts w:cs="Arial"/>
+                <w:bCs/>
+              </w:rPr>
+              <w:t xml:space="preserve">repo </w:t>
+            </w:r>
+            <w:r>
+              <w:rPr>
+                <w:rFonts w:cs="Arial"/>
+                <w:bCs/>
+              </w:rPr>
+              <w:t xml:space="preserve">and the </w:t>
+            </w:r>
+            <w:r>
+              <w:rPr>
+                <w:rFonts w:cs="Arial"/>
+                <w:bCs/>
+              </w:rPr>
+              <w:t>Discord</w:t>
+            </w:r>
+            <w:r>
+              <w:rPr>
+                <w:rFonts w:cs="Arial"/>
+                <w:bCs/>
+              </w:rPr>
+              <w:t xml:space="preserve"> group chat.</w:t>
             </w:r>
           </w:p>
         </w:tc>
@@ -2004,7 +2065,21 @@
                 <w:rFonts w:cs="Arial"/>
                 <w:bCs/>
               </w:rPr>
-              <w:t>. Everyone’s opinion will be valued and heard out.</w:t>
+              <w:t xml:space="preserve">. Everyone’s opinion will be valued and heard </w:t>
+            </w:r>
+            <w:r>
+              <w:rPr>
+                <w:rFonts w:cs="Arial"/>
+                <w:bCs/>
+              </w:rPr>
+              <w:t>and considered</w:t>
+            </w:r>
+            <w:r>
+              <w:rPr>
+                <w:rFonts w:cs="Arial"/>
+                <w:bCs/>
+              </w:rPr>
+              <w:t>.</w:t>
             </w:r>
             <w:r>
               <w:rPr>
@@ -2585,22 +2660,46 @@
         </w:pBdr>
       </w:pPr>
       <w:r>
-        <w:t>Conflicts will be discussed during meetings or through the discord group chat. All decisions</w:t>
-      </w:r>
-      <w:r>
-        <w:t xml:space="preserve"> will be made to ensure a 100. The professor’s coding style will be followed where possible. The entire group will be delegated a task for every deliverable.</w:t>
-      </w:r>
-      <w:r>
-        <w:t xml:space="preserve"> This group values the quality of work much more heavily than </w:t>
-      </w:r>
-      <w:r>
-        <w:t xml:space="preserve">attendance, and so attendance will not be </w:t>
-      </w:r>
-      <w:r>
-        <w:t>highly prioritized</w:t>
-      </w:r>
-      <w:r>
-        <w:t>.</w:t>
+        <w:t xml:space="preserve">Conflicts will be discussed during meetings or through the </w:t>
+      </w:r>
+      <w:r>
+        <w:t>Discord</w:t>
+      </w:r>
+      <w:r>
+        <w:t xml:space="preserve"> group chat. All decisions</w:t>
+      </w:r>
+      <w:r>
+        <w:t xml:space="preserve"> will be made to ensure </w:t>
+      </w:r>
+      <w:r>
+        <w:t>the highest mar</w:t>
+      </w:r>
+      <w:r>
+        <w:t>ks</w:t>
+      </w:r>
+      <w:r>
+        <w:t>. The professor’s coding style will be followed where possible. The entire group will be delegated a task for every deliverable.</w:t>
+      </w:r>
+      <w:r>
+        <w:t xml:space="preserve"> </w:t>
+      </w:r>
+      <w:r>
+        <w:t>Attendance issues are expected since most of the group is employed,</w:t>
+      </w:r>
+      <w:r>
+        <w:t xml:space="preserve"> the strategy to remedy this will be wi</w:t>
+      </w:r>
+      <w:r>
+        <w:t xml:space="preserve">th frequent communication. Our group is determined to </w:t>
+      </w:r>
+      <w:r>
+        <w:t>show</w:t>
+      </w:r>
+      <w:r>
+        <w:t xml:space="preserve"> that attendance should not matter as much as </w:t>
+      </w:r>
+      <w:r>
+        <w:t>knowledge and effort.</w:t>
       </w:r>
     </w:p>
     <w:p>
@@ -2994,7 +3093,6 @@
         <w:pStyle w:val="Heading2"/>
       </w:pPr>
       <w:r>
-        <w:lastRenderedPageBreak/>
         <w:t>Game Details</w:t>
       </w:r>
     </w:p>
@@ -3014,19 +3112,49 @@
         <w:t>Pokémon</w:t>
       </w:r>
       <w:r>
-        <w:t xml:space="preserve"> style fighting game with several stages. </w:t>
+        <w:t>-</w:t>
+      </w:r>
+      <w:r>
+        <w:t xml:space="preserve">style fighting game with several stages. </w:t>
       </w:r>
       <w:r>
         <w:t xml:space="preserve">The </w:t>
       </w:r>
       <w:r>
-        <w:t xml:space="preserve">main modal will be used to explore the different parts of the map. This will be achieved by splitting the </w:t>
-      </w:r>
-      <w:r>
-        <w:t xml:space="preserve">modal </w:t>
-      </w:r>
-      <w:r>
-        <w:t xml:space="preserve">up into many rows and columns, and upon click certain columns with arrow indicators, users will be able to explore the different areas. </w:t>
+        <w:t xml:space="preserve">main </w:t>
+      </w:r>
+      <w:r>
+        <w:t xml:space="preserve">window </w:t>
+      </w:r>
+      <w:r>
+        <w:t xml:space="preserve">will be used to explore the different parts of the map. This will be achieved by splitting the </w:t>
+      </w:r>
+      <w:r>
+        <w:t>window</w:t>
+      </w:r>
+      <w:r>
+        <w:t xml:space="preserve"> </w:t>
+      </w:r>
+      <w:r>
+        <w:t>up into many rows and columns, and upon click</w:t>
+      </w:r>
+      <w:r>
+        <w:t>ing</w:t>
+      </w:r>
+      <w:r>
+        <w:t xml:space="preserve"> certain </w:t>
+      </w:r>
+      <w:r>
+        <w:t xml:space="preserve">tiles </w:t>
+      </w:r>
+      <w:r>
+        <w:t xml:space="preserve">with </w:t>
+      </w:r>
+      <w:r>
+        <w:t xml:space="preserve">images of </w:t>
+      </w:r>
+      <w:r>
+        <w:t xml:space="preserve">arrow indicators, users will be able to explore the different areas. </w:t>
       </w:r>
       <w:r>
         <w:t>There will be collectable items throughout the map which you can gift to NPCs</w:t>
@@ -3056,7 +3184,13 @@
         <w:t xml:space="preserve"> </w:t>
       </w:r>
       <w:r>
-        <w:t>The game will include a feature which will autosave the player’s game each time they make a move.</w:t>
+        <w:t>The game will include a feature which will auto</w:t>
+      </w:r>
+      <w:r>
+        <w:t>-</w:t>
+      </w:r>
+      <w:r>
+        <w:t>save the player’s game each time they make a move.</w:t>
       </w:r>
     </w:p>
     <w:p>
@@ -3084,7 +3218,13 @@
         <w:t>turn-based combat logic. The game must allow interactions between NPCs.</w:t>
       </w:r>
       <w:r>
-        <w:t xml:space="preserve"> The system must manage the map and modify it accordingly. The game must be autosaved frequently.</w:t>
+        <w:t xml:space="preserve"> The system must manage the map and modify it accordingly. The game must be auto</w:t>
+      </w:r>
+      <w:r>
+        <w:t>-</w:t>
+      </w:r>
+      <w:r>
+        <w:t>saved frequently.</w:t>
       </w:r>
     </w:p>
     <w:p>
@@ -3197,13 +3337,43 @@
         <w:t xml:space="preserve">The last element which we believe </w:t>
       </w:r>
       <w:r>
-        <w:t xml:space="preserve">will be challenging is the implementation of hirable NPCs. We want </w:t>
-      </w:r>
-      <w:r>
-        <w:t xml:space="preserve">to create an inventory system specifically targeted towards hiring NPCs. Once you give an NPC an item they want, we want them to be able to help the player </w:t>
-      </w:r>
-      <w:r>
-        <w:t>during fights, whether that is through additional exp gains or increasing their stats.</w:t>
+        <w:t xml:space="preserve">will be challenging is the implementation of </w:t>
+      </w:r>
+      <w:r>
+        <w:t>recruitable</w:t>
+      </w:r>
+      <w:r>
+        <w:t xml:space="preserve"> NPCs. We want </w:t>
+      </w:r>
+      <w:r>
+        <w:t xml:space="preserve">to create an inventory system specifically targeted towards hiring NPCs. Once you give an NPC an item they want, </w:t>
+      </w:r>
+      <w:r>
+        <w:t>they will be available</w:t>
+      </w:r>
+      <w:r>
+        <w:t xml:space="preserve"> to help the player </w:t>
+      </w:r>
+      <w:r>
+        <w:t xml:space="preserve">during fights, whether that is </w:t>
+      </w:r>
+      <w:r>
+        <w:t>by increasing the amount of exp</w:t>
+      </w:r>
+      <w:r>
+        <w:t>erience points</w:t>
+      </w:r>
+      <w:r>
+        <w:t xml:space="preserve"> gained </w:t>
+      </w:r>
+      <w:r>
+        <w:t>or increasing the</w:t>
+      </w:r>
+      <w:r>
+        <w:t xml:space="preserve"> player’s</w:t>
+      </w:r>
+      <w:r>
+        <w:t xml:space="preserve"> stats.</w:t>
       </w:r>
     </w:p>
     <w:p>
@@ -3221,7 +3391,13 @@
     </w:p>
     <w:p>
       <w:r>
-        <w:t xml:space="preserve">We have created a GitHub and invited all the appropriate parties. </w:t>
+        <w:t xml:space="preserve">We have created a </w:t>
+      </w:r>
+      <w:r>
+        <w:t xml:space="preserve">private </w:t>
+      </w:r>
+      <w:r>
+        <w:t xml:space="preserve">GitHub and invited all the appropriate parties. </w:t>
       </w:r>
       <w:r>
         <w:t xml:space="preserve">We have also implemented </w:t>
@@ -3233,7 +3409,16 @@
         <w:t xml:space="preserve">. All source code is contained within the src folder, the docs folder contains notes or documents about the game, </w:t>
       </w:r>
       <w:r>
-        <w:t>the assets folder contains assets to be used and the versions file may be used to store previous versions of the game.</w:t>
+        <w:t xml:space="preserve">the assets folder contains assets to be used and the versions </w:t>
+      </w:r>
+      <w:r>
+        <w:t>folder</w:t>
+      </w:r>
+      <w:r>
+        <w:t xml:space="preserve"> may be used to store previous versions of the game.</w:t>
+      </w:r>
+      <w:r>
+        <w:t xml:space="preserve"> </w:t>
       </w:r>
     </w:p>
     <w:sectPr>

</xml_diff>